<commit_message>
Finished lab, still need to record video.
</commit_message>
<xml_diff>
--- a/Lab 1/Lab1Template.docx
+++ b/Lab 1/Lab1Template.docx
@@ -86,6 +86,7 @@
           <w:ilvl w:val="0"/>
           <w:numId w:val="0"/>
         </w:numPr>
+        <w:ind w:hanging="0" w:left="0"/>
         <w:outlineLvl w:val="0"/>
         <w:rPr>
           <w:b/>
@@ -118,6 +119,53 @@
         <w:rPr/>
       </w:pPr>
       <w:r>
+        <w:drawing>
+          <wp:anchor behindDoc="0" distT="0" distB="0" distL="0" distR="0" simplePos="0" locked="0" layoutInCell="0" allowOverlap="1" relativeHeight="28">
+            <wp:simplePos x="0" y="0"/>
+            <wp:positionH relativeFrom="column">
+              <wp:align>center</wp:align>
+            </wp:positionH>
+            <wp:positionV relativeFrom="paragraph">
+              <wp:posOffset>635</wp:posOffset>
+            </wp:positionV>
+            <wp:extent cx="5943600" cy="4502785"/>
+            <wp:effectExtent l="0" t="0" r="0" b="0"/>
+            <wp:wrapSquare wrapText="largest"/>
+            <wp:docPr id="1" name="Image1" descr=""/>
+            <wp:cNvGraphicFramePr>
+              <a:graphicFrameLocks xmlns:a="http://schemas.openxmlformats.org/drawingml/2006/main" noChangeAspect="1"/>
+            </wp:cNvGraphicFramePr>
+            <a:graphic xmlns:a="http://schemas.openxmlformats.org/drawingml/2006/main">
+              <a:graphicData uri="http://schemas.openxmlformats.org/drawingml/2006/picture">
+                <pic:pic xmlns:pic="http://schemas.openxmlformats.org/drawingml/2006/picture">
+                  <pic:nvPicPr>
+                    <pic:cNvPr id="1" name="Image1" descr=""/>
+                    <pic:cNvPicPr>
+                      <a:picLocks noChangeAspect="1" noChangeArrowheads="1"/>
+                    </pic:cNvPicPr>
+                  </pic:nvPicPr>
+                  <pic:blipFill>
+                    <a:blip r:embed="rId2"/>
+                    <a:stretch>
+                      <a:fillRect/>
+                    </a:stretch>
+                  </pic:blipFill>
+                  <pic:spPr bwMode="auto">
+                    <a:xfrm>
+                      <a:off x="0" y="0"/>
+                      <a:ext cx="5943600" cy="4502785"/>
+                    </a:xfrm>
+                    <a:prstGeom prst="rect">
+                      <a:avLst/>
+                    </a:prstGeom>
+                  </pic:spPr>
+                </pic:pic>
+              </a:graphicData>
+            </a:graphic>
+          </wp:anchor>
+        </w:drawing>
+      </w:r>
+      <w:r>
         <w:rPr/>
         <w:t>Please comment on the single biggest issue you were facing when designing the circuit.</w:t>
       </w:r>
@@ -129,6 +177,16 @@
       </w:pPr>
       <w:r>
         <w:rPr/>
+        <w:t>I did not face any issues while creating this circuit.</w:t>
+      </w:r>
+    </w:p>
+    <w:p>
+      <w:pPr>
+        <w:pStyle w:val="Normal"/>
+        <w:rPr/>
+      </w:pPr>
+      <w:r>
+        <w:rPr/>
         <w:t>Include a picture of your waveform (timing diagram) here:</w:t>
       </w:r>
     </w:p>
@@ -139,7 +197,71 @@
       </w:pPr>
       <w:r>
         <w:rPr/>
+        <w:drawing>
+          <wp:anchor behindDoc="0" distT="0" distB="0" distL="0" distR="0" simplePos="0" locked="0" layoutInCell="0" allowOverlap="1" relativeHeight="29">
+            <wp:simplePos x="0" y="0"/>
+            <wp:positionH relativeFrom="column">
+              <wp:align>center</wp:align>
+            </wp:positionH>
+            <wp:positionV relativeFrom="paragraph">
+              <wp:posOffset>635</wp:posOffset>
+            </wp:positionV>
+            <wp:extent cx="5943600" cy="3949065"/>
+            <wp:effectExtent l="0" t="0" r="0" b="0"/>
+            <wp:wrapSquare wrapText="largest"/>
+            <wp:docPr id="2" name="Image2" descr=""/>
+            <wp:cNvGraphicFramePr>
+              <a:graphicFrameLocks xmlns:a="http://schemas.openxmlformats.org/drawingml/2006/main" noChangeAspect="1"/>
+            </wp:cNvGraphicFramePr>
+            <a:graphic xmlns:a="http://schemas.openxmlformats.org/drawingml/2006/main">
+              <a:graphicData uri="http://schemas.openxmlformats.org/drawingml/2006/picture">
+                <pic:pic xmlns:pic="http://schemas.openxmlformats.org/drawingml/2006/picture">
+                  <pic:nvPicPr>
+                    <pic:cNvPr id="2" name="Image2" descr=""/>
+                    <pic:cNvPicPr>
+                      <a:picLocks noChangeAspect="1" noChangeArrowheads="1"/>
+                    </pic:cNvPicPr>
+                  </pic:nvPicPr>
+                  <pic:blipFill>
+                    <a:blip r:embed="rId3"/>
+                    <a:stretch>
+                      <a:fillRect/>
+                    </a:stretch>
+                  </pic:blipFill>
+                  <pic:spPr bwMode="auto">
+                    <a:xfrm>
+                      <a:off x="0" y="0"/>
+                      <a:ext cx="5943600" cy="3949065"/>
+                    </a:xfrm>
+                    <a:prstGeom prst="rect">
+                      <a:avLst/>
+                    </a:prstGeom>
+                  </pic:spPr>
+                </pic:pic>
+              </a:graphicData>
+            </a:graphic>
+          </wp:anchor>
+        </w:drawing>
+      </w:r>
+    </w:p>
+    <w:p>
+      <w:pPr>
+        <w:pStyle w:val="Normal"/>
+        <w:rPr/>
+      </w:pPr>
+      <w:r>
+        <w:rPr/>
         <w:t>Did the circuit behave as expected? If no, what was wrong?</w:t>
+      </w:r>
+    </w:p>
+    <w:p>
+      <w:pPr>
+        <w:pStyle w:val="Normal"/>
+        <w:rPr/>
+      </w:pPr>
+      <w:r>
+        <w:rPr/>
+        <w:t>Yes, the circuit behaved as expected.</w:t>
       </w:r>
     </w:p>
     <w:p>
@@ -166,11 +288,8 @@
         </w:rPr>
       </w:pPr>
       <w:r>
-        <w:rPr>
-          <w:b/>
-          <w:sz w:val="28"/>
-          <w:szCs w:val="28"/>
-        </w:rPr>
+        <w:rPr/>
+        <w:t>I did not face any issues simulating the circuit.</w:t>
       </w:r>
     </w:p>
     <w:p>
@@ -180,6 +299,7 @@
           <w:ilvl w:val="0"/>
           <w:numId w:val="0"/>
         </w:numPr>
+        <w:ind w:hanging="0" w:left="0"/>
         <w:outlineLvl w:val="0"/>
         <w:rPr>
           <w:b/>
@@ -213,6 +333,60 @@
       </w:pPr>
       <w:r>
         <w:rPr/>
+        <w:drawing>
+          <wp:anchor behindDoc="0" distT="0" distB="0" distL="0" distR="0" simplePos="0" locked="0" layoutInCell="0" allowOverlap="1" relativeHeight="30">
+            <wp:simplePos x="0" y="0"/>
+            <wp:positionH relativeFrom="column">
+              <wp:align>center</wp:align>
+            </wp:positionH>
+            <wp:positionV relativeFrom="paragraph">
+              <wp:posOffset>635</wp:posOffset>
+            </wp:positionV>
+            <wp:extent cx="5943600" cy="4502785"/>
+            <wp:effectExtent l="0" t="0" r="0" b="0"/>
+            <wp:wrapSquare wrapText="largest"/>
+            <wp:docPr id="3" name="Image3" descr=""/>
+            <wp:cNvGraphicFramePr>
+              <a:graphicFrameLocks xmlns:a="http://schemas.openxmlformats.org/drawingml/2006/main" noChangeAspect="1"/>
+            </wp:cNvGraphicFramePr>
+            <a:graphic xmlns:a="http://schemas.openxmlformats.org/drawingml/2006/main">
+              <a:graphicData uri="http://schemas.openxmlformats.org/drawingml/2006/picture">
+                <pic:pic xmlns:pic="http://schemas.openxmlformats.org/drawingml/2006/picture">
+                  <pic:nvPicPr>
+                    <pic:cNvPr id="3" name="Image3" descr=""/>
+                    <pic:cNvPicPr>
+                      <a:picLocks noChangeAspect="1" noChangeArrowheads="1"/>
+                    </pic:cNvPicPr>
+                  </pic:nvPicPr>
+                  <pic:blipFill>
+                    <a:blip r:embed="rId4"/>
+                    <a:stretch>
+                      <a:fillRect/>
+                    </a:stretch>
+                  </pic:blipFill>
+                  <pic:spPr bwMode="auto">
+                    <a:xfrm>
+                      <a:off x="0" y="0"/>
+                      <a:ext cx="5943600" cy="4502785"/>
+                    </a:xfrm>
+                    <a:prstGeom prst="rect">
+                      <a:avLst/>
+                    </a:prstGeom>
+                  </pic:spPr>
+                </pic:pic>
+              </a:graphicData>
+            </a:graphic>
+          </wp:anchor>
+        </w:drawing>
+      </w:r>
+    </w:p>
+    <w:p>
+      <w:pPr>
+        <w:pStyle w:val="Normal"/>
+        <w:rPr/>
+      </w:pPr>
+      <w:r>
+        <w:rPr/>
         <w:t>Please comment on the single biggest issue you were facing when designing the circuit.</w:t>
       </w:r>
     </w:p>
@@ -223,6 +397,16 @@
       </w:pPr>
       <w:r>
         <w:rPr/>
+        <w:t>I kept connecting wires I wanted to connect to the sum to cry on the half adder, and vice versa.</w:t>
+      </w:r>
+    </w:p>
+    <w:p>
+      <w:pPr>
+        <w:pStyle w:val="Normal"/>
+        <w:rPr/>
+      </w:pPr>
+      <w:r>
+        <w:rPr/>
         <w:t>Include a picture of your waveform (timing diagram) here:</w:t>
       </w:r>
     </w:p>
@@ -233,6 +417,60 @@
       </w:pPr>
       <w:r>
         <w:rPr/>
+        <w:drawing>
+          <wp:anchor behindDoc="0" distT="0" distB="0" distL="0" distR="0" simplePos="0" locked="0" layoutInCell="0" allowOverlap="1" relativeHeight="31">
+            <wp:simplePos x="0" y="0"/>
+            <wp:positionH relativeFrom="column">
+              <wp:posOffset>0</wp:posOffset>
+            </wp:positionH>
+            <wp:positionV relativeFrom="paragraph">
+              <wp:posOffset>635</wp:posOffset>
+            </wp:positionV>
+            <wp:extent cx="5943600" cy="3945255"/>
+            <wp:effectExtent l="0" t="0" r="0" b="0"/>
+            <wp:wrapSquare wrapText="largest"/>
+            <wp:docPr id="4" name="Image4" descr=""/>
+            <wp:cNvGraphicFramePr>
+              <a:graphicFrameLocks xmlns:a="http://schemas.openxmlformats.org/drawingml/2006/main" noChangeAspect="1"/>
+            </wp:cNvGraphicFramePr>
+            <a:graphic xmlns:a="http://schemas.openxmlformats.org/drawingml/2006/main">
+              <a:graphicData uri="http://schemas.openxmlformats.org/drawingml/2006/picture">
+                <pic:pic xmlns:pic="http://schemas.openxmlformats.org/drawingml/2006/picture">
+                  <pic:nvPicPr>
+                    <pic:cNvPr id="4" name="Image4" descr=""/>
+                    <pic:cNvPicPr>
+                      <a:picLocks noChangeAspect="1" noChangeArrowheads="1"/>
+                    </pic:cNvPicPr>
+                  </pic:nvPicPr>
+                  <pic:blipFill>
+                    <a:blip r:embed="rId5"/>
+                    <a:stretch>
+                      <a:fillRect/>
+                    </a:stretch>
+                  </pic:blipFill>
+                  <pic:spPr bwMode="auto">
+                    <a:xfrm>
+                      <a:off x="0" y="0"/>
+                      <a:ext cx="5943600" cy="3945255"/>
+                    </a:xfrm>
+                    <a:prstGeom prst="rect">
+                      <a:avLst/>
+                    </a:prstGeom>
+                  </pic:spPr>
+                </pic:pic>
+              </a:graphicData>
+            </a:graphic>
+          </wp:anchor>
+        </w:drawing>
+      </w:r>
+    </w:p>
+    <w:p>
+      <w:pPr>
+        <w:pStyle w:val="Normal"/>
+        <w:rPr/>
+      </w:pPr>
+      <w:r>
+        <w:rPr/>
         <w:t>Did the circuit behave as expected? If no, what was wrong?</w:t>
       </w:r>
     </w:p>
@@ -243,7 +481,27 @@
       </w:pPr>
       <w:r>
         <w:rPr/>
+        <w:t>The circuit is working as expected.</w:t>
+      </w:r>
+    </w:p>
+    <w:p>
+      <w:pPr>
+        <w:pStyle w:val="Normal"/>
+        <w:rPr/>
+      </w:pPr>
+      <w:r>
+        <w:rPr/>
         <w:t>Please comment on the single biggest issue you were facing when simulating the circuit.</w:t>
+      </w:r>
+    </w:p>
+    <w:p>
+      <w:pPr>
+        <w:pStyle w:val="Normal"/>
+        <w:rPr/>
+      </w:pPr>
+      <w:r>
+        <w:rPr/>
+        <w:t>I did not face any issues simulating the circuit.</w:t>
       </w:r>
     </w:p>
     <w:p>
@@ -270,6 +528,7 @@
           <w:ilvl w:val="0"/>
           <w:numId w:val="0"/>
         </w:numPr>
+        <w:ind w:hanging="0" w:left="0"/>
         <w:outlineLvl w:val="0"/>
         <w:rPr>
           <w:b/>
@@ -303,6 +562,60 @@
       </w:pPr>
       <w:r>
         <w:rPr/>
+        <w:drawing>
+          <wp:anchor behindDoc="0" distT="0" distB="0" distL="0" distR="0" simplePos="0" locked="0" layoutInCell="0" allowOverlap="1" relativeHeight="32">
+            <wp:simplePos x="0" y="0"/>
+            <wp:positionH relativeFrom="column">
+              <wp:align>center</wp:align>
+            </wp:positionH>
+            <wp:positionV relativeFrom="paragraph">
+              <wp:posOffset>635</wp:posOffset>
+            </wp:positionV>
+            <wp:extent cx="5943600" cy="4502785"/>
+            <wp:effectExtent l="0" t="0" r="0" b="0"/>
+            <wp:wrapSquare wrapText="largest"/>
+            <wp:docPr id="5" name="Image5" descr=""/>
+            <wp:cNvGraphicFramePr>
+              <a:graphicFrameLocks xmlns:a="http://schemas.openxmlformats.org/drawingml/2006/main" noChangeAspect="1"/>
+            </wp:cNvGraphicFramePr>
+            <a:graphic xmlns:a="http://schemas.openxmlformats.org/drawingml/2006/main">
+              <a:graphicData uri="http://schemas.openxmlformats.org/drawingml/2006/picture">
+                <pic:pic xmlns:pic="http://schemas.openxmlformats.org/drawingml/2006/picture">
+                  <pic:nvPicPr>
+                    <pic:cNvPr id="5" name="Image5" descr=""/>
+                    <pic:cNvPicPr>
+                      <a:picLocks noChangeAspect="1" noChangeArrowheads="1"/>
+                    </pic:cNvPicPr>
+                  </pic:nvPicPr>
+                  <pic:blipFill>
+                    <a:blip r:embed="rId6"/>
+                    <a:stretch>
+                      <a:fillRect/>
+                    </a:stretch>
+                  </pic:blipFill>
+                  <pic:spPr bwMode="auto">
+                    <a:xfrm>
+                      <a:off x="0" y="0"/>
+                      <a:ext cx="5943600" cy="4502785"/>
+                    </a:xfrm>
+                    <a:prstGeom prst="rect">
+                      <a:avLst/>
+                    </a:prstGeom>
+                  </pic:spPr>
+                </pic:pic>
+              </a:graphicData>
+            </a:graphic>
+          </wp:anchor>
+        </w:drawing>
+      </w:r>
+    </w:p>
+    <w:p>
+      <w:pPr>
+        <w:pStyle w:val="Normal"/>
+        <w:rPr/>
+      </w:pPr>
+      <w:r>
+        <w:rPr/>
         <w:t>Please comment on the single biggest issue you were facing when designing the circuit.</w:t>
       </w:r>
     </w:p>
@@ -313,6 +626,16 @@
       </w:pPr>
       <w:r>
         <w:rPr/>
+        <w:t>For some reason, I wanted to make the circuit as small as possible, which resulted in me routing the wires to the and gates in ways that I did not want to do, as there were already wires in the places that I would have preferred to put them if I gave myself a reasonable amount of space. I have no clue why I did this to myself.</w:t>
+      </w:r>
+    </w:p>
+    <w:p>
+      <w:pPr>
+        <w:pStyle w:val="Normal"/>
+        <w:rPr/>
+      </w:pPr>
+      <w:r>
+        <w:rPr/>
         <w:t>Include a picture of your waveform (timing diagram) here:</w:t>
       </w:r>
     </w:p>
@@ -323,6 +646,60 @@
       </w:pPr>
       <w:r>
         <w:rPr/>
+        <w:drawing>
+          <wp:anchor behindDoc="0" distT="0" distB="0" distL="0" distR="0" simplePos="0" locked="0" layoutInCell="0" allowOverlap="1" relativeHeight="33">
+            <wp:simplePos x="0" y="0"/>
+            <wp:positionH relativeFrom="column">
+              <wp:align>center</wp:align>
+            </wp:positionH>
+            <wp:positionV relativeFrom="paragraph">
+              <wp:posOffset>635</wp:posOffset>
+            </wp:positionV>
+            <wp:extent cx="5943600" cy="3949065"/>
+            <wp:effectExtent l="0" t="0" r="0" b="0"/>
+            <wp:wrapSquare wrapText="largest"/>
+            <wp:docPr id="6" name="Image6" descr=""/>
+            <wp:cNvGraphicFramePr>
+              <a:graphicFrameLocks xmlns:a="http://schemas.openxmlformats.org/drawingml/2006/main" noChangeAspect="1"/>
+            </wp:cNvGraphicFramePr>
+            <a:graphic xmlns:a="http://schemas.openxmlformats.org/drawingml/2006/main">
+              <a:graphicData uri="http://schemas.openxmlformats.org/drawingml/2006/picture">
+                <pic:pic xmlns:pic="http://schemas.openxmlformats.org/drawingml/2006/picture">
+                  <pic:nvPicPr>
+                    <pic:cNvPr id="6" name="Image6" descr=""/>
+                    <pic:cNvPicPr>
+                      <a:picLocks noChangeAspect="1" noChangeArrowheads="1"/>
+                    </pic:cNvPicPr>
+                  </pic:nvPicPr>
+                  <pic:blipFill>
+                    <a:blip r:embed="rId7"/>
+                    <a:stretch>
+                      <a:fillRect/>
+                    </a:stretch>
+                  </pic:blipFill>
+                  <pic:spPr bwMode="auto">
+                    <a:xfrm>
+                      <a:off x="0" y="0"/>
+                      <a:ext cx="5943600" cy="3949065"/>
+                    </a:xfrm>
+                    <a:prstGeom prst="rect">
+                      <a:avLst/>
+                    </a:prstGeom>
+                  </pic:spPr>
+                </pic:pic>
+              </a:graphicData>
+            </a:graphic>
+          </wp:anchor>
+        </w:drawing>
+      </w:r>
+    </w:p>
+    <w:p>
+      <w:pPr>
+        <w:pStyle w:val="Normal"/>
+        <w:rPr/>
+      </w:pPr>
+      <w:r>
+        <w:rPr/>
         <w:t>Did the circuit behave as expected? If no, what was wrong?</w:t>
       </w:r>
     </w:p>
@@ -333,24 +710,27 @@
       </w:pPr>
       <w:r>
         <w:rPr/>
+        <w:t>Yes, the circuit behaved as expected.</w:t>
+      </w:r>
+    </w:p>
+    <w:p>
+      <w:pPr>
+        <w:pStyle w:val="Normal"/>
+        <w:rPr/>
+      </w:pPr>
+      <w:r>
+        <w:rPr/>
         <w:t>Please comment on the single biggest issue you were facing when simulating the circuit.</w:t>
       </w:r>
     </w:p>
     <w:p>
       <w:pPr>
         <w:pStyle w:val="Normal"/>
-        <w:rPr>
-          <w:b/>
-          <w:sz w:val="28"/>
-          <w:szCs w:val="28"/>
-        </w:rPr>
-      </w:pPr>
-      <w:r>
-        <w:rPr>
-          <w:b/>
-          <w:sz w:val="28"/>
-          <w:szCs w:val="28"/>
-        </w:rPr>
+        <w:rPr/>
+      </w:pPr>
+      <w:r>
+        <w:rPr/>
+        <w:t>I forgot to export the verilog file, and then got errors when I was simulating (the non-existent file). Once I actually exported the file, everything worked.</w:t>
       </w:r>
     </w:p>
     <w:p>
@@ -360,6 +740,7 @@
           <w:ilvl w:val="0"/>
           <w:numId w:val="0"/>
         </w:numPr>
+        <w:ind w:hanging="0" w:left="0"/>
         <w:outlineLvl w:val="0"/>
         <w:rPr>
           <w:b/>
@@ -393,6 +774,60 @@
       </w:pPr>
       <w:r>
         <w:rPr/>
+        <w:drawing>
+          <wp:anchor behindDoc="0" distT="0" distB="0" distL="0" distR="0" simplePos="0" locked="0" layoutInCell="0" allowOverlap="1" relativeHeight="34">
+            <wp:simplePos x="0" y="0"/>
+            <wp:positionH relativeFrom="column">
+              <wp:align>center</wp:align>
+            </wp:positionH>
+            <wp:positionV relativeFrom="paragraph">
+              <wp:posOffset>635</wp:posOffset>
+            </wp:positionV>
+            <wp:extent cx="5943600" cy="4502785"/>
+            <wp:effectExtent l="0" t="0" r="0" b="0"/>
+            <wp:wrapSquare wrapText="largest"/>
+            <wp:docPr id="7" name="Image7" descr=""/>
+            <wp:cNvGraphicFramePr>
+              <a:graphicFrameLocks xmlns:a="http://schemas.openxmlformats.org/drawingml/2006/main" noChangeAspect="1"/>
+            </wp:cNvGraphicFramePr>
+            <a:graphic xmlns:a="http://schemas.openxmlformats.org/drawingml/2006/main">
+              <a:graphicData uri="http://schemas.openxmlformats.org/drawingml/2006/picture">
+                <pic:pic xmlns:pic="http://schemas.openxmlformats.org/drawingml/2006/picture">
+                  <pic:nvPicPr>
+                    <pic:cNvPr id="7" name="Image7" descr=""/>
+                    <pic:cNvPicPr>
+                      <a:picLocks noChangeAspect="1" noChangeArrowheads="1"/>
+                    </pic:cNvPicPr>
+                  </pic:nvPicPr>
+                  <pic:blipFill>
+                    <a:blip r:embed="rId8"/>
+                    <a:stretch>
+                      <a:fillRect/>
+                    </a:stretch>
+                  </pic:blipFill>
+                  <pic:spPr bwMode="auto">
+                    <a:xfrm>
+                      <a:off x="0" y="0"/>
+                      <a:ext cx="5943600" cy="4502785"/>
+                    </a:xfrm>
+                    <a:prstGeom prst="rect">
+                      <a:avLst/>
+                    </a:prstGeom>
+                  </pic:spPr>
+                </pic:pic>
+              </a:graphicData>
+            </a:graphic>
+          </wp:anchor>
+        </w:drawing>
+      </w:r>
+    </w:p>
+    <w:p>
+      <w:pPr>
+        <w:pStyle w:val="Normal"/>
+        <w:rPr/>
+      </w:pPr>
+      <w:r>
+        <w:rPr/>
         <w:t>Please comment on the single biggest issue you were facing when designing the circuit.</w:t>
       </w:r>
     </w:p>
@@ -403,7 +838,71 @@
       </w:pPr>
       <w:r>
         <w:rPr/>
+        <w:t>I did not face any issues designing this circuit.</w:t>
+      </w:r>
+    </w:p>
+    <w:p>
+      <w:pPr>
+        <w:pStyle w:val="Normal"/>
+        <w:rPr/>
+      </w:pPr>
+      <w:r>
+        <w:rPr/>
         <w:t>Include a picture of your waveform (timing diagram) here:</w:t>
+      </w:r>
+    </w:p>
+    <w:p>
+      <w:pPr>
+        <w:pStyle w:val="Normal"/>
+        <w:rPr/>
+      </w:pPr>
+      <w:r>
+        <w:rPr/>
+        <w:drawing>
+          <wp:anchor behindDoc="0" distT="0" distB="0" distL="0" distR="0" simplePos="0" locked="0" layoutInCell="0" allowOverlap="1" relativeHeight="35">
+            <wp:simplePos x="0" y="0"/>
+            <wp:positionH relativeFrom="column">
+              <wp:align>center</wp:align>
+            </wp:positionH>
+            <wp:positionV relativeFrom="paragraph">
+              <wp:posOffset>635</wp:posOffset>
+            </wp:positionV>
+            <wp:extent cx="5943600" cy="3949065"/>
+            <wp:effectExtent l="0" t="0" r="0" b="0"/>
+            <wp:wrapSquare wrapText="largest"/>
+            <wp:docPr id="8" name="Image8" descr=""/>
+            <wp:cNvGraphicFramePr>
+              <a:graphicFrameLocks xmlns:a="http://schemas.openxmlformats.org/drawingml/2006/main" noChangeAspect="1"/>
+            </wp:cNvGraphicFramePr>
+            <a:graphic xmlns:a="http://schemas.openxmlformats.org/drawingml/2006/main">
+              <a:graphicData uri="http://schemas.openxmlformats.org/drawingml/2006/picture">
+                <pic:pic xmlns:pic="http://schemas.openxmlformats.org/drawingml/2006/picture">
+                  <pic:nvPicPr>
+                    <pic:cNvPr id="8" name="Image8" descr=""/>
+                    <pic:cNvPicPr>
+                      <a:picLocks noChangeAspect="1" noChangeArrowheads="1"/>
+                    </pic:cNvPicPr>
+                  </pic:nvPicPr>
+                  <pic:blipFill>
+                    <a:blip r:embed="rId9"/>
+                    <a:stretch>
+                      <a:fillRect/>
+                    </a:stretch>
+                  </pic:blipFill>
+                  <pic:spPr bwMode="auto">
+                    <a:xfrm>
+                      <a:off x="0" y="0"/>
+                      <a:ext cx="5943600" cy="3949065"/>
+                    </a:xfrm>
+                    <a:prstGeom prst="rect">
+                      <a:avLst/>
+                    </a:prstGeom>
+                  </pic:spPr>
+                </pic:pic>
+              </a:graphicData>
+            </a:graphic>
+          </wp:anchor>
+        </w:drawing>
       </w:r>
     </w:p>
     <w:p>
@@ -431,8 +930,8 @@
         <w:tblLook w:val="0420" w:noHBand="0" w:noVBand="1" w:firstColumn="0" w:lastRow="0" w:lastColumn="0" w:firstRow="1"/>
       </w:tblPr>
       <w:tblGrid>
-        <w:gridCol w:w="2334"/>
-        <w:gridCol w:w="5658"/>
+        <w:gridCol w:w="2333"/>
+        <w:gridCol w:w="5659"/>
         <w:gridCol w:w="1358"/>
       </w:tblGrid>
       <w:tr>
@@ -441,7 +940,7 @@
         </w:trPr>
         <w:tc>
           <w:tcPr>
-            <w:tcW w:w="2334" w:type="dxa"/>
+            <w:tcW w:w="2333" w:type="dxa"/>
             <w:tcBorders>
               <w:top w:val="single" w:sz="4" w:space="0" w:color="999999"/>
               <w:left w:val="single" w:sz="4" w:space="0" w:color="999999"/>
@@ -473,7 +972,7 @@
         </w:tc>
         <w:tc>
           <w:tcPr>
-            <w:tcW w:w="5658" w:type="dxa"/>
+            <w:tcW w:w="5659" w:type="dxa"/>
             <w:tcBorders>
               <w:top w:val="single" w:sz="4" w:space="0" w:color="999999"/>
               <w:left w:val="single" w:sz="4" w:space="0" w:color="999999"/>
@@ -499,7 +998,7 @@
                 <w:sz w:val="24"/>
                 <w:szCs w:val="24"/>
               </w:rPr>
-              <w:t xml:space="preserve">Test motivation </w:t>
+              <w:t>Test motivation</w:t>
             </w:r>
           </w:p>
         </w:tc>
@@ -542,7 +1041,7 @@
         </w:trPr>
         <w:tc>
           <w:tcPr>
-            <w:tcW w:w="2334" w:type="dxa"/>
+            <w:tcW w:w="2333" w:type="dxa"/>
             <w:tcBorders>
               <w:top w:val="single" w:sz="4" w:space="0" w:color="999999"/>
               <w:left w:val="single" w:sz="4" w:space="0" w:color="999999"/>
@@ -570,7 +1069,7 @@
         </w:tc>
         <w:tc>
           <w:tcPr>
-            <w:tcW w:w="5658" w:type="dxa"/>
+            <w:tcW w:w="5659" w:type="dxa"/>
             <w:tcBorders>
               <w:top w:val="single" w:sz="4" w:space="0" w:color="999999"/>
               <w:left w:val="single" w:sz="4" w:space="0" w:color="999999"/>
@@ -620,6 +1119,7 @@
                 <w:sz w:val="24"/>
                 <w:szCs w:val="24"/>
               </w:rPr>
+              <w:t>Pass</w:t>
             </w:r>
           </w:p>
         </w:tc>
@@ -628,7 +1128,7 @@
         <w:trPr/>
         <w:tc>
           <w:tcPr>
-            <w:tcW w:w="2334" w:type="dxa"/>
+            <w:tcW w:w="2333" w:type="dxa"/>
             <w:tcBorders>
               <w:top w:val="single" w:sz="4" w:space="0" w:color="999999"/>
               <w:left w:val="single" w:sz="4" w:space="0" w:color="999999"/>
@@ -650,12 +1150,13 @@
                 <w:sz w:val="24"/>
                 <w:szCs w:val="24"/>
               </w:rPr>
-            </w:r>
-          </w:p>
-        </w:tc>
-        <w:tc>
-          <w:tcPr>
-            <w:tcW w:w="5658" w:type="dxa"/>
+              <w:t>0_7_0_3_4</w:t>
+            </w:r>
+          </w:p>
+        </w:tc>
+        <w:tc>
+          <w:tcPr>
+            <w:tcW w:w="5659" w:type="dxa"/>
             <w:tcBorders>
               <w:top w:val="single" w:sz="4" w:space="0" w:color="999999"/>
               <w:left w:val="single" w:sz="4" w:space="0" w:color="999999"/>
@@ -677,6 +1178,7 @@
                 <w:sz w:val="24"/>
                 <w:szCs w:val="24"/>
               </w:rPr>
+              <w:t>Verify a + b is correct for unsigned values of a and b with no overflow and signed values of +a and +b where there is no overflow</w:t>
             </w:r>
           </w:p>
         </w:tc>
@@ -704,15 +1206,18 @@
                 <w:sz w:val="24"/>
                 <w:szCs w:val="24"/>
               </w:rPr>
+              <w:t>Pass</w:t>
             </w:r>
           </w:p>
         </w:tc>
       </w:tr>
       <w:tr>
-        <w:trPr/>
-        <w:tc>
-          <w:tcPr>
-            <w:tcW w:w="2334" w:type="dxa"/>
+        <w:trPr>
+          <w:trHeight w:val="1356" w:hRule="atLeast"/>
+        </w:trPr>
+        <w:tc>
+          <w:tcPr>
+            <w:tcW w:w="2333" w:type="dxa"/>
             <w:tcBorders>
               <w:top w:val="single" w:sz="4" w:space="0" w:color="999999"/>
               <w:left w:val="single" w:sz="4" w:space="0" w:color="999999"/>
@@ -734,12 +1239,13 @@
                 <w:sz w:val="24"/>
                 <w:szCs w:val="24"/>
               </w:rPr>
-            </w:r>
-          </w:p>
-        </w:tc>
-        <w:tc>
-          <w:tcPr>
-            <w:tcW w:w="5658" w:type="dxa"/>
+              <w:t>0_7_1_1_5</w:t>
+            </w:r>
+          </w:p>
+        </w:tc>
+        <w:tc>
+          <w:tcPr>
+            <w:tcW w:w="5659" w:type="dxa"/>
             <w:tcBorders>
               <w:top w:val="single" w:sz="4" w:space="0" w:color="999999"/>
               <w:left w:val="single" w:sz="4" w:space="0" w:color="999999"/>
@@ -761,6 +1267,7 @@
                 <w:sz w:val="24"/>
                 <w:szCs w:val="24"/>
               </w:rPr>
+              <w:t>Verify a + b+1 is correct for unsigned values of a and b with no overflow and signed values of +a and +b where there is no overflow</w:t>
             </w:r>
           </w:p>
         </w:tc>
@@ -788,6 +1295,7 @@
                 <w:sz w:val="24"/>
                 <w:szCs w:val="24"/>
               </w:rPr>
+              <w:t>Pass</w:t>
             </w:r>
           </w:p>
         </w:tc>
@@ -796,7 +1304,7 @@
         <w:trPr/>
         <w:tc>
           <w:tcPr>
-            <w:tcW w:w="2334" w:type="dxa"/>
+            <w:tcW w:w="2333" w:type="dxa"/>
             <w:tcBorders>
               <w:top w:val="single" w:sz="4" w:space="0" w:color="999999"/>
               <w:left w:val="single" w:sz="4" w:space="0" w:color="999999"/>
@@ -818,12 +1326,13 @@
                 <w:sz w:val="24"/>
                 <w:szCs w:val="24"/>
               </w:rPr>
-            </w:r>
-          </w:p>
-        </w:tc>
-        <w:tc>
-          <w:tcPr>
-            <w:tcW w:w="5658" w:type="dxa"/>
+              <w:t>2_D_0_7_6</w:t>
+            </w:r>
+          </w:p>
+        </w:tc>
+        <w:tc>
+          <w:tcPr>
+            <w:tcW w:w="5659" w:type="dxa"/>
             <w:tcBorders>
               <w:top w:val="single" w:sz="4" w:space="0" w:color="999999"/>
               <w:left w:val="single" w:sz="4" w:space="0" w:color="999999"/>
@@ -845,6 +1354,7 @@
                 <w:sz w:val="24"/>
                 <w:szCs w:val="24"/>
               </w:rPr>
+              <w:t>Verify a + b is correct for unsigned values of a and b with no overflow and signed values of +a and +b where there is overflow</w:t>
             </w:r>
           </w:p>
         </w:tc>
@@ -872,6 +1382,7 @@
                 <w:sz w:val="24"/>
                 <w:szCs w:val="24"/>
               </w:rPr>
+              <w:t>Pass</w:t>
             </w:r>
           </w:p>
         </w:tc>
@@ -880,7 +1391,7 @@
         <w:trPr/>
         <w:tc>
           <w:tcPr>
-            <w:tcW w:w="2334" w:type="dxa"/>
+            <w:tcW w:w="2333" w:type="dxa"/>
             <w:tcBorders>
               <w:top w:val="single" w:sz="4" w:space="0" w:color="999999"/>
               <w:left w:val="single" w:sz="4" w:space="0" w:color="999999"/>
@@ -902,12 +1413,13 @@
                 <w:sz w:val="24"/>
                 <w:szCs w:val="24"/>
               </w:rPr>
-            </w:r>
-          </w:p>
-        </w:tc>
-        <w:tc>
-          <w:tcPr>
-            <w:tcW w:w="5658" w:type="dxa"/>
+              <w:t>2_E_1_7_6</w:t>
+            </w:r>
+          </w:p>
+        </w:tc>
+        <w:tc>
+          <w:tcPr>
+            <w:tcW w:w="5659" w:type="dxa"/>
             <w:tcBorders>
               <w:top w:val="single" w:sz="4" w:space="0" w:color="999999"/>
               <w:left w:val="single" w:sz="4" w:space="0" w:color="999999"/>
@@ -929,6 +1441,7 @@
                 <w:sz w:val="24"/>
                 <w:szCs w:val="24"/>
               </w:rPr>
+              <w:t>Verify a + b+1 is correct for unsigned values of a and b with no overflow and signed values of +a and +b where there is overflow</w:t>
             </w:r>
           </w:p>
         </w:tc>
@@ -956,6 +1469,7 @@
                 <w:sz w:val="24"/>
                 <w:szCs w:val="24"/>
               </w:rPr>
+              <w:t>Pass</w:t>
             </w:r>
           </w:p>
         </w:tc>
@@ -964,7 +1478,7 @@
         <w:trPr/>
         <w:tc>
           <w:tcPr>
-            <w:tcW w:w="2334" w:type="dxa"/>
+            <w:tcW w:w="2333" w:type="dxa"/>
             <w:tcBorders>
               <w:top w:val="single" w:sz="4" w:space="0" w:color="999999"/>
               <w:left w:val="single" w:sz="4" w:space="0" w:color="999999"/>
@@ -986,12 +1500,13 @@
                 <w:sz w:val="24"/>
                 <w:szCs w:val="24"/>
               </w:rPr>
-            </w:r>
-          </w:p>
-        </w:tc>
-        <w:tc>
-          <w:tcPr>
-            <w:tcW w:w="5658" w:type="dxa"/>
+              <w:t>1_A_0_F_B</w:t>
+            </w:r>
+          </w:p>
+        </w:tc>
+        <w:tc>
+          <w:tcPr>
+            <w:tcW w:w="5659" w:type="dxa"/>
             <w:tcBorders>
               <w:top w:val="single" w:sz="4" w:space="0" w:color="999999"/>
               <w:left w:val="single" w:sz="4" w:space="0" w:color="999999"/>
@@ -1013,6 +1528,7 @@
                 <w:sz w:val="24"/>
                 <w:szCs w:val="24"/>
               </w:rPr>
+              <w:t>Verify a + b is correct for unsigned values of a and b with overflow and signed values of -a and -b where there is no overflow</w:t>
             </w:r>
           </w:p>
         </w:tc>
@@ -1040,6 +1556,7 @@
                 <w:sz w:val="24"/>
                 <w:szCs w:val="24"/>
               </w:rPr>
+              <w:t>Pass</w:t>
             </w:r>
           </w:p>
         </w:tc>
@@ -1048,7 +1565,7 @@
         <w:trPr/>
         <w:tc>
           <w:tcPr>
-            <w:tcW w:w="2334" w:type="dxa"/>
+            <w:tcW w:w="2333" w:type="dxa"/>
             <w:tcBorders>
               <w:top w:val="single" w:sz="4" w:space="0" w:color="999999"/>
               <w:left w:val="single" w:sz="4" w:space="0" w:color="999999"/>
@@ -1070,12 +1587,13 @@
                 <w:sz w:val="24"/>
                 <w:szCs w:val="24"/>
               </w:rPr>
-            </w:r>
-          </w:p>
-        </w:tc>
-        <w:tc>
-          <w:tcPr>
-            <w:tcW w:w="5658" w:type="dxa"/>
+              <w:t>1_A_1_D_C</w:t>
+            </w:r>
+          </w:p>
+        </w:tc>
+        <w:tc>
+          <w:tcPr>
+            <w:tcW w:w="5659" w:type="dxa"/>
             <w:tcBorders>
               <w:top w:val="single" w:sz="4" w:space="0" w:color="999999"/>
               <w:left w:val="single" w:sz="4" w:space="0" w:color="999999"/>
@@ -1097,6 +1615,7 @@
                 <w:sz w:val="24"/>
                 <w:szCs w:val="24"/>
               </w:rPr>
+              <w:t>Verify a + b+1 is correct for unsigned values of a and b with overflow and signed values of -a and -b where there is no overflow</w:t>
             </w:r>
           </w:p>
         </w:tc>
@@ -1124,6 +1643,7 @@
                 <w:sz w:val="24"/>
                 <w:szCs w:val="24"/>
               </w:rPr>
+              <w:t>Pass</w:t>
             </w:r>
           </w:p>
         </w:tc>
@@ -1132,7 +1652,7 @@
         <w:trPr/>
         <w:tc>
           <w:tcPr>
-            <w:tcW w:w="2334" w:type="dxa"/>
+            <w:tcW w:w="2333" w:type="dxa"/>
             <w:tcBorders>
               <w:top w:val="single" w:sz="4" w:space="0" w:color="999999"/>
               <w:left w:val="single" w:sz="4" w:space="0" w:color="999999"/>
@@ -1154,12 +1674,13 @@
                 <w:sz w:val="24"/>
                 <w:szCs w:val="24"/>
               </w:rPr>
-            </w:r>
-          </w:p>
-        </w:tc>
-        <w:tc>
-          <w:tcPr>
-            <w:tcW w:w="5658" w:type="dxa"/>
+              <w:t>3_1_0_9_8</w:t>
+            </w:r>
+          </w:p>
+        </w:tc>
+        <w:tc>
+          <w:tcPr>
+            <w:tcW w:w="5659" w:type="dxa"/>
             <w:tcBorders>
               <w:top w:val="single" w:sz="4" w:space="0" w:color="999999"/>
               <w:left w:val="single" w:sz="4" w:space="0" w:color="999999"/>
@@ -1181,6 +1702,7 @@
                 <w:sz w:val="24"/>
                 <w:szCs w:val="24"/>
               </w:rPr>
+              <w:t>Verify a + b is correct for unsigned values of a and b with overflow and signed values of -a and -b where there is overflow</w:t>
             </w:r>
           </w:p>
         </w:tc>
@@ -1208,6 +1730,7 @@
                 <w:sz w:val="24"/>
                 <w:szCs w:val="24"/>
               </w:rPr>
+              <w:t>Pass</w:t>
             </w:r>
           </w:p>
         </w:tc>
@@ -1216,7 +1739,7 @@
         <w:trPr/>
         <w:tc>
           <w:tcPr>
-            <w:tcW w:w="2334" w:type="dxa"/>
+            <w:tcW w:w="2333" w:type="dxa"/>
             <w:tcBorders>
               <w:top w:val="single" w:sz="4" w:space="0" w:color="999999"/>
               <w:left w:val="single" w:sz="4" w:space="0" w:color="999999"/>
@@ -1238,12 +1761,13 @@
                 <w:sz w:val="24"/>
                 <w:szCs w:val="24"/>
               </w:rPr>
-            </w:r>
-          </w:p>
-        </w:tc>
-        <w:tc>
-          <w:tcPr>
-            <w:tcW w:w="5658" w:type="dxa"/>
+              <w:t>3_5_1_A_A</w:t>
+            </w:r>
+          </w:p>
+        </w:tc>
+        <w:tc>
+          <w:tcPr>
+            <w:tcW w:w="5659" w:type="dxa"/>
             <w:tcBorders>
               <w:top w:val="single" w:sz="4" w:space="0" w:color="999999"/>
               <w:left w:val="single" w:sz="4" w:space="0" w:color="999999"/>
@@ -1265,6 +1789,7 @@
                 <w:sz w:val="24"/>
                 <w:szCs w:val="24"/>
               </w:rPr>
+              <w:t>Verify a + b+1 is correct for unsigned values of a and b with overflow and signed values of -a and -b where there is overflow</w:t>
             </w:r>
           </w:p>
         </w:tc>
@@ -1292,6 +1817,7 @@
                 <w:sz w:val="24"/>
                 <w:szCs w:val="24"/>
               </w:rPr>
+              <w:t>Pass</w:t>
             </w:r>
           </w:p>
         </w:tc>
@@ -1300,7 +1826,7 @@
         <w:trPr/>
         <w:tc>
           <w:tcPr>
-            <w:tcW w:w="2334" w:type="dxa"/>
+            <w:tcW w:w="2333" w:type="dxa"/>
             <w:tcBorders>
               <w:top w:val="single" w:sz="4" w:space="0" w:color="999999"/>
               <w:left w:val="single" w:sz="4" w:space="0" w:color="999999"/>
@@ -1322,12 +1848,13 @@
                 <w:sz w:val="24"/>
                 <w:szCs w:val="24"/>
               </w:rPr>
-            </w:r>
-          </w:p>
-        </w:tc>
-        <w:tc>
-          <w:tcPr>
-            <w:tcW w:w="5658" w:type="dxa"/>
+              <w:t>1_0_1_7_8</w:t>
+            </w:r>
+          </w:p>
+        </w:tc>
+        <w:tc>
+          <w:tcPr>
+            <w:tcW w:w="5659" w:type="dxa"/>
             <w:tcBorders>
               <w:top w:val="single" w:sz="4" w:space="0" w:color="999999"/>
               <w:left w:val="single" w:sz="4" w:space="0" w:color="999999"/>
@@ -1349,6 +1876,7 @@
                 <w:sz w:val="24"/>
                 <w:szCs w:val="24"/>
               </w:rPr>
+              <w:t>Verify that a+b+1 overflows when a+b would not overflow where a and b are unsigned</w:t>
             </w:r>
           </w:p>
         </w:tc>
@@ -1376,6 +1904,7 @@
                 <w:sz w:val="24"/>
                 <w:szCs w:val="24"/>
               </w:rPr>
+              <w:t>Pass</w:t>
             </w:r>
           </w:p>
         </w:tc>
@@ -1384,7 +1913,7 @@
         <w:trPr/>
         <w:tc>
           <w:tcPr>
-            <w:tcW w:w="2334" w:type="dxa"/>
+            <w:tcW w:w="2333" w:type="dxa"/>
             <w:tcBorders>
               <w:top w:val="single" w:sz="4" w:space="0" w:color="999999"/>
               <w:left w:val="single" w:sz="4" w:space="0" w:color="999999"/>
@@ -1406,12 +1935,13 @@
                 <w:sz w:val="24"/>
                 <w:szCs w:val="24"/>
               </w:rPr>
-            </w:r>
-          </w:p>
-        </w:tc>
-        <w:tc>
-          <w:tcPr>
-            <w:tcW w:w="5658" w:type="dxa"/>
+              <w:t>2_8_1_3_4</w:t>
+            </w:r>
+          </w:p>
+        </w:tc>
+        <w:tc>
+          <w:tcPr>
+            <w:tcW w:w="5659" w:type="dxa"/>
             <w:tcBorders>
               <w:top w:val="single" w:sz="4" w:space="0" w:color="999999"/>
               <w:left w:val="single" w:sz="4" w:space="0" w:color="999999"/>
@@ -1433,6 +1963,7 @@
                 <w:sz w:val="24"/>
                 <w:szCs w:val="24"/>
               </w:rPr>
+              <w:t>Verify that a+b+1 overflows when a+b would not overflow where a and b are signed</w:t>
             </w:r>
           </w:p>
         </w:tc>
@@ -1460,6 +1991,7 @@
                 <w:sz w:val="24"/>
                 <w:szCs w:val="24"/>
               </w:rPr>
+              <w:t>Pass</w:t>
             </w:r>
           </w:p>
         </w:tc>
@@ -1468,7 +2000,7 @@
         <w:trPr/>
         <w:tc>
           <w:tcPr>
-            <w:tcW w:w="2334" w:type="dxa"/>
+            <w:tcW w:w="2333" w:type="dxa"/>
             <w:tcBorders>
               <w:top w:val="single" w:sz="4" w:space="0" w:color="999999"/>
               <w:left w:val="single" w:sz="4" w:space="0" w:color="999999"/>
@@ -1490,12 +2022,13 @@
                 <w:sz w:val="24"/>
                 <w:szCs w:val="24"/>
               </w:rPr>
-            </w:r>
-          </w:p>
-        </w:tc>
-        <w:tc>
-          <w:tcPr>
-            <w:tcW w:w="5658" w:type="dxa"/>
+              <w:t>1_8_1_C_B</w:t>
+            </w:r>
+          </w:p>
+        </w:tc>
+        <w:tc>
+          <w:tcPr>
+            <w:tcW w:w="5659" w:type="dxa"/>
             <w:tcBorders>
               <w:top w:val="single" w:sz="4" w:space="0" w:color="999999"/>
               <w:left w:val="single" w:sz="4" w:space="0" w:color="999999"/>
@@ -1517,6 +2050,7 @@
                 <w:sz w:val="24"/>
                 <w:szCs w:val="24"/>
               </w:rPr>
+              <w:t>Verify that a+b+1 does not overflow when a+b would overflow where a and b are signed</w:t>
             </w:r>
           </w:p>
         </w:tc>
@@ -1544,15 +2078,18 @@
                 <w:sz w:val="24"/>
                 <w:szCs w:val="24"/>
               </w:rPr>
+              <w:t>Pass</w:t>
             </w:r>
           </w:p>
         </w:tc>
       </w:tr>
       <w:tr>
-        <w:trPr/>
-        <w:tc>
-          <w:tcPr>
-            <w:tcW w:w="2334" w:type="dxa"/>
+        <w:trPr>
+          <w:trHeight w:val="620" w:hRule="atLeast"/>
+        </w:trPr>
+        <w:tc>
+          <w:tcPr>
+            <w:tcW w:w="2333" w:type="dxa"/>
             <w:tcBorders>
               <w:top w:val="single" w:sz="4" w:space="0" w:color="999999"/>
               <w:left w:val="single" w:sz="4" w:space="0" w:color="999999"/>
@@ -1574,12 +2111,13 @@
                 <w:sz w:val="24"/>
                 <w:szCs w:val="24"/>
               </w:rPr>
-            </w:r>
-          </w:p>
-        </w:tc>
-        <w:tc>
-          <w:tcPr>
-            <w:tcW w:w="5658" w:type="dxa"/>
+              <w:t>1_2_0_3_F</w:t>
+            </w:r>
+          </w:p>
+        </w:tc>
+        <w:tc>
+          <w:tcPr>
+            <w:tcW w:w="5659" w:type="dxa"/>
             <w:tcBorders>
               <w:top w:val="single" w:sz="4" w:space="0" w:color="999999"/>
               <w:left w:val="single" w:sz="4" w:space="0" w:color="999999"/>
@@ -1601,6 +2139,7 @@
                 <w:sz w:val="24"/>
                 <w:szCs w:val="24"/>
               </w:rPr>
+              <w:t>Verify a + b is correct for +a and -b</w:t>
             </w:r>
           </w:p>
         </w:tc>
@@ -1628,6 +2167,7 @@
                 <w:sz w:val="24"/>
                 <w:szCs w:val="24"/>
               </w:rPr>
+              <w:t>Pass</w:t>
             </w:r>
           </w:p>
         </w:tc>
@@ -1636,7 +2176,7 @@
         <w:trPr/>
         <w:tc>
           <w:tcPr>
-            <w:tcW w:w="2334" w:type="dxa"/>
+            <w:tcW w:w="2333" w:type="dxa"/>
             <w:tcBorders>
               <w:top w:val="single" w:sz="4" w:space="0" w:color="999999"/>
               <w:left w:val="single" w:sz="4" w:space="0" w:color="999999"/>
@@ -1648,23 +2188,23 @@
             <w:pPr>
               <w:pStyle w:val="Normal"/>
               <w:spacing w:before="0" w:after="200"/>
-              <w:ind w:firstLine="720"/>
-              <w:rPr>
-                <w:sz w:val="24"/>
-                <w:szCs w:val="24"/>
-              </w:rPr>
-            </w:pPr>
-            <w:r>
-              <w:rPr>
-                <w:sz w:val="24"/>
-                <w:szCs w:val="24"/>
-              </w:rPr>
-            </w:r>
-          </w:p>
-        </w:tc>
-        <w:tc>
-          <w:tcPr>
-            <w:tcW w:w="5658" w:type="dxa"/>
+              <w:rPr>
+                <w:sz w:val="24"/>
+                <w:szCs w:val="24"/>
+              </w:rPr>
+            </w:pPr>
+            <w:r>
+              <w:rPr>
+                <w:sz w:val="24"/>
+                <w:szCs w:val="24"/>
+              </w:rPr>
+              <w:t>1_2_0_F_3</w:t>
+            </w:r>
+          </w:p>
+        </w:tc>
+        <w:tc>
+          <w:tcPr>
+            <w:tcW w:w="5659" w:type="dxa"/>
             <w:tcBorders>
               <w:top w:val="single" w:sz="4" w:space="0" w:color="999999"/>
               <w:left w:val="single" w:sz="4" w:space="0" w:color="999999"/>
@@ -1686,6 +2226,7 @@
                 <w:sz w:val="24"/>
                 <w:szCs w:val="24"/>
               </w:rPr>
+              <w:t>Verify a + b is correct for -a and +b</w:t>
             </w:r>
           </w:p>
         </w:tc>
@@ -1713,6 +2254,7 @@
                 <w:sz w:val="24"/>
                 <w:szCs w:val="24"/>
               </w:rPr>
+              <w:t>Pass</w:t>
             </w:r>
           </w:p>
         </w:tc>
@@ -1721,7 +2263,7 @@
         <w:trPr/>
         <w:tc>
           <w:tcPr>
-            <w:tcW w:w="2334" w:type="dxa"/>
+            <w:tcW w:w="2333" w:type="dxa"/>
             <w:tcBorders>
               <w:top w:val="single" w:sz="4" w:space="0" w:color="999999"/>
               <w:left w:val="single" w:sz="4" w:space="0" w:color="999999"/>
@@ -1743,12 +2285,13 @@
                 <w:sz w:val="24"/>
                 <w:szCs w:val="24"/>
               </w:rPr>
-            </w:r>
-          </w:p>
-        </w:tc>
-        <w:tc>
-          <w:tcPr>
-            <w:tcW w:w="5658" w:type="dxa"/>
+              <w:t>1_0_1_8_7</w:t>
+            </w:r>
+          </w:p>
+        </w:tc>
+        <w:tc>
+          <w:tcPr>
+            <w:tcW w:w="5659" w:type="dxa"/>
             <w:tcBorders>
               <w:top w:val="single" w:sz="4" w:space="0" w:color="999999"/>
               <w:left w:val="single" w:sz="4" w:space="0" w:color="999999"/>
@@ -1770,6 +2313,7 @@
                 <w:sz w:val="24"/>
                 <w:szCs w:val="24"/>
               </w:rPr>
+              <w:t>Verify a + b+1 is correct for +a and -b</w:t>
             </w:r>
           </w:p>
         </w:tc>
@@ -1797,6 +2341,7 @@
                 <w:sz w:val="24"/>
                 <w:szCs w:val="24"/>
               </w:rPr>
+              <w:t>Pass</w:t>
             </w:r>
           </w:p>
         </w:tc>
@@ -1805,7 +2350,7 @@
         <w:trPr/>
         <w:tc>
           <w:tcPr>
-            <w:tcW w:w="2334" w:type="dxa"/>
+            <w:tcW w:w="2333" w:type="dxa"/>
             <w:tcBorders>
               <w:top w:val="single" w:sz="4" w:space="0" w:color="999999"/>
               <w:left w:val="single" w:sz="4" w:space="0" w:color="999999"/>
@@ -1827,12 +2372,13 @@
                 <w:sz w:val="24"/>
                 <w:szCs w:val="24"/>
               </w:rPr>
-            </w:r>
-          </w:p>
-        </w:tc>
-        <w:tc>
-          <w:tcPr>
-            <w:tcW w:w="5658" w:type="dxa"/>
+              <w:t>1_0_1_7_8</w:t>
+            </w:r>
+          </w:p>
+        </w:tc>
+        <w:tc>
+          <w:tcPr>
+            <w:tcW w:w="5659" w:type="dxa"/>
             <w:tcBorders>
               <w:top w:val="single" w:sz="4" w:space="0" w:color="999999"/>
               <w:left w:val="single" w:sz="4" w:space="0" w:color="999999"/>
@@ -1854,6 +2400,7 @@
                 <w:sz w:val="24"/>
                 <w:szCs w:val="24"/>
               </w:rPr>
+              <w:t>Verify a + b+1 is correct for -a and +b</w:t>
             </w:r>
           </w:p>
         </w:tc>
@@ -1881,6 +2428,7 @@
                 <w:sz w:val="24"/>
                 <w:szCs w:val="24"/>
               </w:rPr>
+              <w:t>Pass</w:t>
             </w:r>
           </w:p>
         </w:tc>
@@ -1920,6 +2468,7 @@
       </w:pPr>
       <w:r>
         <w:rPr/>
+        <w:t>I struggled to think of the last few test cases for the numbers</w:t>
       </w:r>
     </w:p>
     <w:p>
@@ -1929,6 +2478,7 @@
           <w:ilvl w:val="0"/>
           <w:numId w:val="0"/>
         </w:numPr>
+        <w:ind w:hanging="0" w:left="0"/>
         <w:outlineLvl w:val="0"/>
         <w:rPr>
           <w:b/>
@@ -2231,8 +2781,8 @@
         <w:tblLook w:val="0020" w:noHBand="0" w:noVBand="0" w:firstColumn="0" w:lastRow="0" w:lastColumn="0" w:firstRow="1"/>
       </w:tblPr>
       <w:tblGrid>
-        <w:gridCol w:w="6209"/>
-        <w:gridCol w:w="1261"/>
+        <w:gridCol w:w="6208"/>
+        <w:gridCol w:w="1262"/>
         <w:gridCol w:w="1260"/>
       </w:tblGrid>
       <w:tr>
@@ -2243,7 +2793,7 @@
         </w:trPr>
         <w:tc>
           <w:tcPr>
-            <w:tcW w:w="6209" w:type="dxa"/>
+            <w:tcW w:w="6208" w:type="dxa"/>
             <w:tcBorders>
               <w:top w:val="single" w:sz="18" w:space="0" w:color="000000"/>
               <w:left w:val="single" w:sz="18" w:space="0" w:color="000000"/>
@@ -2273,7 +2823,7 @@
         </w:tc>
         <w:tc>
           <w:tcPr>
-            <w:tcW w:w="1261" w:type="dxa"/>
+            <w:tcW w:w="1262" w:type="dxa"/>
             <w:tcBorders>
               <w:top w:val="single" w:sz="18" w:space="0" w:color="000000"/>
               <w:left w:val="single" w:sz="8" w:space="0" w:color="000000"/>
@@ -2345,7 +2895,7 @@
         </w:trPr>
         <w:tc>
           <w:tcPr>
-            <w:tcW w:w="6209" w:type="dxa"/>
+            <w:tcW w:w="6208" w:type="dxa"/>
             <w:tcBorders>
               <w:top w:val="single" w:sz="6" w:space="0" w:color="000000"/>
               <w:left w:val="single" w:sz="18" w:space="0" w:color="000000"/>
@@ -2375,7 +2925,7 @@
         </w:tc>
         <w:tc>
           <w:tcPr>
-            <w:tcW w:w="1261" w:type="dxa"/>
+            <w:tcW w:w="1262" w:type="dxa"/>
             <w:tcBorders>
               <w:top w:val="single" w:sz="6" w:space="0" w:color="000000"/>
               <w:left w:val="single" w:sz="8" w:space="0" w:color="000000"/>
@@ -2435,7 +2985,7 @@
         </w:trPr>
         <w:tc>
           <w:tcPr>
-            <w:tcW w:w="6209" w:type="dxa"/>
+            <w:tcW w:w="6208" w:type="dxa"/>
             <w:tcBorders>
               <w:top w:val="single" w:sz="6" w:space="0" w:color="000000"/>
               <w:left w:val="single" w:sz="18" w:space="0" w:color="000000"/>
@@ -2458,13 +3008,13 @@
                 <w:sz w:val="24"/>
                 <w:szCs w:val="24"/>
               </w:rPr>
-              <w:t xml:space="preserve">Task 1-1: Build and Test a 1-Bit Half-Adder </w:t>
-            </w:r>
-          </w:p>
-        </w:tc>
-        <w:tc>
-          <w:tcPr>
-            <w:tcW w:w="1261" w:type="dxa"/>
+              <w:t>Task 1-1: Build and Test a 1-Bit Half-Adder</w:t>
+            </w:r>
+          </w:p>
+        </w:tc>
+        <w:tc>
+          <w:tcPr>
+            <w:tcW w:w="1262" w:type="dxa"/>
             <w:tcBorders>
               <w:top w:val="single" w:sz="6" w:space="0" w:color="000000"/>
               <w:left w:val="single" w:sz="8" w:space="0" w:color="000000"/>
@@ -2523,7 +3073,7 @@
         </w:trPr>
         <w:tc>
           <w:tcPr>
-            <w:tcW w:w="6209" w:type="dxa"/>
+            <w:tcW w:w="6208" w:type="dxa"/>
             <w:tcBorders>
               <w:top w:val="single" w:sz="6" w:space="0" w:color="000000"/>
               <w:left w:val="single" w:sz="18" w:space="0" w:color="000000"/>
@@ -2551,7 +3101,7 @@
         </w:tc>
         <w:tc>
           <w:tcPr>
-            <w:tcW w:w="1261" w:type="dxa"/>
+            <w:tcW w:w="1262" w:type="dxa"/>
             <w:tcBorders>
               <w:top w:val="single" w:sz="6" w:space="0" w:color="000000"/>
               <w:left w:val="single" w:sz="8" w:space="0" w:color="000000"/>
@@ -2610,7 +3160,7 @@
         </w:trPr>
         <w:tc>
           <w:tcPr>
-            <w:tcW w:w="6209" w:type="dxa"/>
+            <w:tcW w:w="6208" w:type="dxa"/>
             <w:tcBorders>
               <w:top w:val="single" w:sz="6" w:space="0" w:color="000000"/>
               <w:left w:val="single" w:sz="18" w:space="0" w:color="000000"/>
@@ -2638,7 +3188,7 @@
         </w:tc>
         <w:tc>
           <w:tcPr>
-            <w:tcW w:w="1261" w:type="dxa"/>
+            <w:tcW w:w="1262" w:type="dxa"/>
             <w:tcBorders>
               <w:top w:val="single" w:sz="6" w:space="0" w:color="000000"/>
               <w:left w:val="single" w:sz="8" w:space="0" w:color="000000"/>
@@ -2697,7 +3247,7 @@
         </w:trPr>
         <w:tc>
           <w:tcPr>
-            <w:tcW w:w="6209" w:type="dxa"/>
+            <w:tcW w:w="6208" w:type="dxa"/>
             <w:tcBorders>
               <w:top w:val="single" w:sz="6" w:space="0" w:color="000000"/>
               <w:left w:val="single" w:sz="18" w:space="0" w:color="000000"/>
@@ -2725,7 +3275,7 @@
         </w:tc>
         <w:tc>
           <w:tcPr>
-            <w:tcW w:w="1261" w:type="dxa"/>
+            <w:tcW w:w="1262" w:type="dxa"/>
             <w:tcBorders>
               <w:top w:val="single" w:sz="6" w:space="0" w:color="000000"/>
               <w:left w:val="single" w:sz="8" w:space="0" w:color="000000"/>
@@ -2784,7 +3334,7 @@
         </w:trPr>
         <w:tc>
           <w:tcPr>
-            <w:tcW w:w="6209" w:type="dxa"/>
+            <w:tcW w:w="6208" w:type="dxa"/>
             <w:tcBorders>
               <w:top w:val="single" w:sz="6" w:space="0" w:color="000000"/>
               <w:left w:val="single" w:sz="18" w:space="0" w:color="000000"/>
@@ -2812,7 +3362,7 @@
         </w:tc>
         <w:tc>
           <w:tcPr>
-            <w:tcW w:w="1261" w:type="dxa"/>
+            <w:tcW w:w="1262" w:type="dxa"/>
             <w:tcBorders>
               <w:top w:val="single" w:sz="6" w:space="0" w:color="000000"/>
               <w:left w:val="single" w:sz="8" w:space="0" w:color="000000"/>
@@ -2871,7 +3421,7 @@
         </w:trPr>
         <w:tc>
           <w:tcPr>
-            <w:tcW w:w="6209" w:type="dxa"/>
+            <w:tcW w:w="6208" w:type="dxa"/>
             <w:tcBorders>
               <w:top w:val="single" w:sz="12" w:space="0" w:color="000000"/>
               <w:left w:val="single" w:sz="18" w:space="0" w:color="000000"/>
@@ -2899,7 +3449,7 @@
         </w:tc>
         <w:tc>
           <w:tcPr>
-            <w:tcW w:w="1261" w:type="dxa"/>
+            <w:tcW w:w="1262" w:type="dxa"/>
             <w:tcBorders>
               <w:top w:val="single" w:sz="12" w:space="0" w:color="000000"/>
               <w:left w:val="single" w:sz="8" w:space="0" w:color="000000"/>
@@ -2961,7 +3511,7 @@
         </w:trPr>
         <w:tc>
           <w:tcPr>
-            <w:tcW w:w="6209" w:type="dxa"/>
+            <w:tcW w:w="6208" w:type="dxa"/>
             <w:tcBorders>
               <w:left w:val="single" w:sz="18" w:space="0" w:color="000000"/>
               <w:right w:val="single" w:sz="8" w:space="0" w:color="000000"/>
@@ -2986,7 +3536,7 @@
         </w:tc>
         <w:tc>
           <w:tcPr>
-            <w:tcW w:w="1261" w:type="dxa"/>
+            <w:tcW w:w="1262" w:type="dxa"/>
             <w:tcBorders>
               <w:top w:val="single" w:sz="12" w:space="0" w:color="000000"/>
               <w:left w:val="single" w:sz="8" w:space="0" w:color="000000"/>
@@ -3048,7 +3598,7 @@
         </w:trPr>
         <w:tc>
           <w:tcPr>
-            <w:tcW w:w="6209" w:type="dxa"/>
+            <w:tcW w:w="6208" w:type="dxa"/>
             <w:tcBorders>
               <w:left w:val="single" w:sz="18" w:space="0" w:color="000000"/>
               <w:bottom w:val="single" w:sz="18" w:space="0" w:color="000000"/>
@@ -3076,7 +3626,7 @@
         </w:tc>
         <w:tc>
           <w:tcPr>
-            <w:tcW w:w="1261" w:type="dxa"/>
+            <w:tcW w:w="1262" w:type="dxa"/>
             <w:tcBorders>
               <w:top w:val="single" w:sz="12" w:space="0" w:color="000000"/>
               <w:left w:val="single" w:sz="8" w:space="0" w:color="000000"/>
@@ -3168,9 +3718,9 @@
       </w:r>
     </w:p>
     <w:sectPr>
-      <w:footerReference w:type="even" r:id="rId2"/>
-      <w:footerReference w:type="default" r:id="rId3"/>
-      <w:footerReference w:type="first" r:id="rId4"/>
+      <w:footerReference w:type="even" r:id="rId10"/>
+      <w:footerReference w:type="default" r:id="rId11"/>
+      <w:footerReference w:type="first" r:id="rId12"/>
       <w:type w:val="nextPage"/>
       <w:pgSz w:w="12240" w:h="15840"/>
       <w:pgMar w:left="1440" w:right="1440" w:gutter="0" w:header="0" w:top="1440" w:footer="720" w:bottom="1440"/>
@@ -3193,12 +3743,10 @@
     </w:pPr>
     <w:r>
       <w:rPr/>
-    </w:r>
-    <w:r>
       <mc:AlternateContent>
         <mc:Choice Requires="wps">
           <w:drawing>
-            <wp:anchor behindDoc="0" distT="0" distB="0" distL="0" distR="0" simplePos="0" locked="0" layoutInCell="1" allowOverlap="1" relativeHeight="0">
+            <wp:anchor behindDoc="1" distT="0" distB="0" distL="0" distR="0" simplePos="0" locked="0" layoutInCell="0" allowOverlap="1" relativeHeight="2">
               <wp:simplePos x="0" y="0"/>
               <wp:positionH relativeFrom="margin">
                 <wp:align>right</wp:align>
@@ -3209,23 +3757,30 @@
               <wp:extent cx="14605" cy="14605"/>
               <wp:effectExtent l="0" t="0" r="0" b="0"/>
               <wp:wrapNone/>
-              <wp:docPr id="1" name="Frame1"/>
+              <wp:docPr id="9" name="Frame1"/>
               <a:graphic xmlns:a="http://schemas.openxmlformats.org/drawingml/2006/main">
                 <a:graphicData uri="http://schemas.microsoft.com/office/word/2010/wordprocessingShape">
                   <wps:wsp>
-                    <wps:cNvSpPr txBox="1"/>
+                    <wps:cNvSpPr/>
                     <wps:spPr>
                       <a:xfrm>
                         <a:off x="0" y="0"/>
-                        <a:ext cx="14605" cy="14605"/>
+                        <a:ext cx="14760" cy="14760"/>
                       </a:xfrm>
-                      <a:prstGeom prst="rect"/>
-                      <a:solidFill>
-                        <a:srgbClr val="FFFFFF">
-                          <a:alpha val="0"/>
-                        </a:srgbClr>
-                      </a:solidFill>
+                      <a:prstGeom prst="rect">
+                        <a:avLst/>
+                      </a:prstGeom>
+                      <a:noFill/>
+                      <a:ln w="0">
+                        <a:noFill/>
+                      </a:ln>
                     </wps:spPr>
+                    <wps:style>
+                      <a:lnRef idx="0"/>
+                      <a:fillRef idx="0"/>
+                      <a:effectRef idx="0"/>
+                      <a:fontRef idx="minor"/>
+                    </wps:style>
                     <wps:txbx>
                       <w:txbxContent>
                         <w:sdt>
@@ -3240,7 +3795,6 @@
                             <w:p>
                               <w:pPr>
                                 <w:pStyle w:val="Footer"/>
-                                <w:pBdr/>
                                 <w:rPr>
                                   <w:rStyle w:val="PageNumber"/>
                                 </w:rPr>
@@ -3280,7 +3834,7 @@
                         </w:sdt>
                       </w:txbxContent>
                     </wps:txbx>
-                    <wps:bodyPr anchor="t" lIns="0" tIns="0" rIns="0" bIns="0">
+                    <wps:bodyPr lIns="0" rIns="0" tIns="0" bIns="0" anchor="t">
                       <a:spAutoFit/>
                     </wps:bodyPr>
                   </wps:wsp>
@@ -3291,9 +3845,10 @@
         </mc:Choice>
         <mc:Fallback>
           <w:pict>
-            <v:rect fillcolor="#FFFFFF" style="position:absolute;rotation:-0;width:1.15pt;height:1.15pt;mso-wrap-distance-left:0pt;mso-wrap-distance-right:0pt;mso-wrap-distance-top:0pt;mso-wrap-distance-bottom:0pt;margin-top:0.05pt;mso-position-vertical-relative:text;margin-left:0pt;mso-position-horizontal:right;mso-position-horizontal-relative:margin">
-              <v:fill opacity="0f"/>
-              <v:textbox inset="0in,0in,0in,0in">
+            <v:rect id="shape_0" ID="Frame1" path="m0,0l-2147483645,0l-2147483645,-2147483646l0,-2147483646xe" fillcolor="white" stroked="f" o:allowincell="f" style="position:absolute;margin-left:0pt;margin-top:0.05pt;width:1.1pt;height:1.1pt;mso-wrap-style:square;v-text-anchor:top;mso-position-horizontal:right;mso-position-horizontal-relative:margin">
+              <v:fill o:detectmouseclick="t" type="solid" color2="black" opacity="0"/>
+              <v:stroke color="#3465a4" joinstyle="round" endcap="flat"/>
+              <v:textbox>
                 <w:txbxContent>
                   <w:sdt>
                     <w:sdtPr>
@@ -3307,7 +3862,6 @@
                       <w:p>
                         <w:pPr>
                           <w:pStyle w:val="Footer"/>
-                          <w:pBdr/>
                           <w:rPr>
                             <w:rStyle w:val="PageNumber"/>
                           </w:rPr>
@@ -3367,13 +3921,10 @@
     </w:pPr>
     <w:r>
       <w:rPr/>
-      <w:t>version 1.0 Spring 2026</w:t>
-    </w:r>
-    <w:r>
       <mc:AlternateContent>
         <mc:Choice Requires="wps">
           <w:drawing>
-            <wp:anchor behindDoc="0" distT="0" distB="0" distL="0" distR="0" simplePos="0" locked="0" layoutInCell="0" allowOverlap="1" relativeHeight="6">
+            <wp:anchor behindDoc="1" distT="0" distB="0" distL="0" distR="0" simplePos="0" locked="0" layoutInCell="0" allowOverlap="1" relativeHeight="26">
               <wp:simplePos x="0" y="0"/>
               <wp:positionH relativeFrom="margin">
                 <wp:align>right</wp:align>
@@ -3381,26 +3932,33 @@
               <wp:positionV relativeFrom="paragraph">
                 <wp:posOffset>635</wp:posOffset>
               </wp:positionV>
-              <wp:extent cx="80645" cy="190500"/>
+              <wp:extent cx="160655" cy="189230"/>
               <wp:effectExtent l="0" t="0" r="0" b="0"/>
               <wp:wrapNone/>
-              <wp:docPr id="2" name="Frame2"/>
+              <wp:docPr id="10" name="Frame2"/>
               <a:graphic xmlns:a="http://schemas.openxmlformats.org/drawingml/2006/main">
                 <a:graphicData uri="http://schemas.microsoft.com/office/word/2010/wordprocessingShape">
                   <wps:wsp>
-                    <wps:cNvSpPr txBox="1"/>
+                    <wps:cNvSpPr/>
                     <wps:spPr>
                       <a:xfrm>
                         <a:off x="0" y="0"/>
-                        <a:ext cx="80645" cy="190500"/>
+                        <a:ext cx="160560" cy="189360"/>
                       </a:xfrm>
-                      <a:prstGeom prst="rect"/>
-                      <a:solidFill>
-                        <a:srgbClr val="FFFFFF">
-                          <a:alpha val="0"/>
-                        </a:srgbClr>
-                      </a:solidFill>
+                      <a:prstGeom prst="rect">
+                        <a:avLst/>
+                      </a:prstGeom>
+                      <a:noFill/>
+                      <a:ln w="0">
+                        <a:noFill/>
+                      </a:ln>
                     </wps:spPr>
+                    <wps:style>
+                      <a:lnRef idx="0"/>
+                      <a:fillRef idx="0"/>
+                      <a:effectRef idx="0"/>
+                      <a:fontRef idx="minor"/>
+                    </wps:style>
                     <wps:txbx>
                       <w:txbxContent>
                         <w:sdt>
@@ -3415,7 +3973,6 @@
                             <w:p>
                               <w:pPr>
                                 <w:pStyle w:val="Footer"/>
-                                <w:pBdr/>
                                 <w:rPr>
                                   <w:rStyle w:val="PageNumber"/>
                                 </w:rPr>
@@ -3442,7 +3999,7 @@
                                 <w:rPr>
                                   <w:rStyle w:val="PageNumber"/>
                                 </w:rPr>
-                                <w:t>5</w:t>
+                                <w:t>12</w:t>
                               </w:r>
                               <w:r>
                                 <w:rPr>
@@ -3455,7 +4012,7 @@
                         </w:sdt>
                       </w:txbxContent>
                     </wps:txbx>
-                    <wps:bodyPr anchor="t" lIns="0" tIns="0" rIns="0" bIns="0">
+                    <wps:bodyPr lIns="0" rIns="0" tIns="0" bIns="0" anchor="t">
                       <a:spAutoFit/>
                     </wps:bodyPr>
                   </wps:wsp>
@@ -3466,9 +4023,10 @@
         </mc:Choice>
         <mc:Fallback>
           <w:pict>
-            <v:rect fillcolor="#FFFFFF" style="position:absolute;rotation:-0;width:6.35pt;height:15pt;mso-wrap-distance-left:0pt;mso-wrap-distance-right:0pt;mso-wrap-distance-top:0pt;mso-wrap-distance-bottom:0pt;margin-top:0.05pt;mso-position-vertical-relative:text;margin-left:461.65pt;mso-position-horizontal:right;mso-position-horizontal-relative:margin">
-              <v:fill opacity="0f"/>
-              <v:textbox inset="0in,0in,0in,0in">
+            <v:rect id="shape_0" ID="Frame2" path="m0,0l-2147483645,0l-2147483645,-2147483646l0,-2147483646xe" fillcolor="white" stroked="f" o:allowincell="f" style="position:absolute;margin-left:455.3pt;margin-top:0.05pt;width:12.6pt;height:14.85pt;mso-wrap-style:square;v-text-anchor:top;mso-position-horizontal:right;mso-position-horizontal-relative:margin">
+              <v:fill o:detectmouseclick="t" type="solid" color2="black" opacity="0"/>
+              <v:stroke color="#3465a4" joinstyle="round" endcap="flat"/>
+              <v:textbox>
                 <w:txbxContent>
                   <w:sdt>
                     <w:sdtPr>
@@ -3482,7 +4040,6 @@
                       <w:p>
                         <w:pPr>
                           <w:pStyle w:val="Footer"/>
-                          <w:pBdr/>
                           <w:rPr>
                             <w:rStyle w:val="PageNumber"/>
                           </w:rPr>
@@ -3509,7 +4066,7 @@
                           <w:rPr>
                             <w:rStyle w:val="PageNumber"/>
                           </w:rPr>
-                          <w:t>5</w:t>
+                          <w:t>12</w:t>
                         </w:r>
                         <w:r>
                           <w:rPr>
@@ -3527,6 +4084,10 @@
           </w:pict>
         </mc:Fallback>
       </mc:AlternateContent>
+    </w:r>
+    <w:r>
+      <w:rPr/>
+      <w:t>version 1.0 Spring 2026</w:t>
     </w:r>
   </w:p>
   <w:p>
@@ -3551,13 +4112,10 @@
     </w:pPr>
     <w:r>
       <w:rPr/>
-      <w:t>version 1.0 Spring 2026</w:t>
-    </w:r>
-    <w:r>
       <mc:AlternateContent>
         <mc:Choice Requires="wps">
           <w:drawing>
-            <wp:anchor behindDoc="0" distT="0" distB="0" distL="0" distR="0" simplePos="0" locked="0" layoutInCell="0" allowOverlap="1" relativeHeight="6">
+            <wp:anchor behindDoc="1" distT="0" distB="0" distL="0" distR="0" simplePos="0" locked="0" layoutInCell="0" allowOverlap="1" relativeHeight="26">
               <wp:simplePos x="0" y="0"/>
               <wp:positionH relativeFrom="margin">
                 <wp:align>right</wp:align>
@@ -3565,26 +4123,33 @@
               <wp:positionV relativeFrom="paragraph">
                 <wp:posOffset>635</wp:posOffset>
               </wp:positionV>
-              <wp:extent cx="80645" cy="190500"/>
+              <wp:extent cx="160655" cy="189230"/>
               <wp:effectExtent l="0" t="0" r="0" b="0"/>
               <wp:wrapNone/>
-              <wp:docPr id="3" name="Frame2"/>
+              <wp:docPr id="11" name="Frame2"/>
               <a:graphic xmlns:a="http://schemas.openxmlformats.org/drawingml/2006/main">
                 <a:graphicData uri="http://schemas.microsoft.com/office/word/2010/wordprocessingShape">
                   <wps:wsp>
-                    <wps:cNvSpPr txBox="1"/>
+                    <wps:cNvSpPr/>
                     <wps:spPr>
                       <a:xfrm>
                         <a:off x="0" y="0"/>
-                        <a:ext cx="80645" cy="190500"/>
+                        <a:ext cx="160560" cy="189360"/>
                       </a:xfrm>
-                      <a:prstGeom prst="rect"/>
-                      <a:solidFill>
-                        <a:srgbClr val="FFFFFF">
-                          <a:alpha val="0"/>
-                        </a:srgbClr>
-                      </a:solidFill>
+                      <a:prstGeom prst="rect">
+                        <a:avLst/>
+                      </a:prstGeom>
+                      <a:noFill/>
+                      <a:ln w="0">
+                        <a:noFill/>
+                      </a:ln>
                     </wps:spPr>
+                    <wps:style>
+                      <a:lnRef idx="0"/>
+                      <a:fillRef idx="0"/>
+                      <a:effectRef idx="0"/>
+                      <a:fontRef idx="minor"/>
+                    </wps:style>
                     <wps:txbx>
                       <w:txbxContent>
                         <w:sdt>
@@ -3599,7 +4164,6 @@
                             <w:p>
                               <w:pPr>
                                 <w:pStyle w:val="Footer"/>
-                                <w:pBdr/>
                                 <w:rPr>
                                   <w:rStyle w:val="PageNumber"/>
                                 </w:rPr>
@@ -3626,7 +4190,7 @@
                                 <w:rPr>
                                   <w:rStyle w:val="PageNumber"/>
                                 </w:rPr>
-                                <w:t>5</w:t>
+                                <w:t>12</w:t>
                               </w:r>
                               <w:r>
                                 <w:rPr>
@@ -3639,7 +4203,7 @@
                         </w:sdt>
                       </w:txbxContent>
                     </wps:txbx>
-                    <wps:bodyPr anchor="t" lIns="0" tIns="0" rIns="0" bIns="0">
+                    <wps:bodyPr lIns="0" rIns="0" tIns="0" bIns="0" anchor="t">
                       <a:spAutoFit/>
                     </wps:bodyPr>
                   </wps:wsp>
@@ -3650,9 +4214,10 @@
         </mc:Choice>
         <mc:Fallback>
           <w:pict>
-            <v:rect fillcolor="#FFFFFF" style="position:absolute;rotation:-0;width:6.35pt;height:15pt;mso-wrap-distance-left:0pt;mso-wrap-distance-right:0pt;mso-wrap-distance-top:0pt;mso-wrap-distance-bottom:0pt;margin-top:0.05pt;mso-position-vertical-relative:text;margin-left:461.65pt;mso-position-horizontal:right;mso-position-horizontal-relative:margin">
-              <v:fill opacity="0f"/>
-              <v:textbox inset="0in,0in,0in,0in">
+            <v:rect id="shape_0" ID="Frame2" path="m0,0l-2147483645,0l-2147483645,-2147483646l0,-2147483646xe" fillcolor="white" stroked="f" o:allowincell="f" style="position:absolute;margin-left:455.3pt;margin-top:0.05pt;width:12.6pt;height:14.85pt;mso-wrap-style:square;v-text-anchor:top;mso-position-horizontal:right;mso-position-horizontal-relative:margin">
+              <v:fill o:detectmouseclick="t" type="solid" color2="black" opacity="0"/>
+              <v:stroke color="#3465a4" joinstyle="round" endcap="flat"/>
+              <v:textbox>
                 <w:txbxContent>
                   <w:sdt>
                     <w:sdtPr>
@@ -3666,7 +4231,6 @@
                       <w:p>
                         <w:pPr>
                           <w:pStyle w:val="Footer"/>
-                          <w:pBdr/>
                           <w:rPr>
                             <w:rStyle w:val="PageNumber"/>
                           </w:rPr>
@@ -3693,7 +4257,7 @@
                           <w:rPr>
                             <w:rStyle w:val="PageNumber"/>
                           </w:rPr>
-                          <w:t>5</w:t>
+                          <w:t>12</w:t>
                         </w:r>
                         <w:r>
                           <w:rPr>
@@ -3711,6 +4275,10 @@
           </w:pict>
         </mc:Fallback>
       </mc:AlternateContent>
+    </w:r>
+    <w:r>
+      <w:rPr/>
+      <w:t>version 1.0 Spring 2026</w:t>
     </w:r>
   </w:p>
   <w:p>
@@ -4266,6 +4834,7 @@
     <w:rsid w:val="005c0318"/>
     <w:pPr>
       <w:widowControl/>
+      <w:suppressAutoHyphens w:val="true"/>
       <w:bidi w:val="0"/>
       <w:spacing w:lineRule="auto" w:line="276" w:before="0" w:after="200"/>
       <w:jc w:val="left"/>
@@ -4276,7 +4845,7 @@
       <w:kern w:val="0"/>
       <w:sz w:val="22"/>
       <w:szCs w:val="22"/>
-      <w:lang w:eastAsia="zh-CN" w:val="en-US" w:bidi="ar-SA"/>
+      <w:lang w:val="en-US" w:eastAsia="zh-CN" w:bidi="ar-SA"/>
     </w:rPr>
   </w:style>
   <w:style w:type="paragraph" w:styleId="Heading1">
@@ -4685,6 +5254,29 @@
     <w:pPr/>
     <w:rPr/>
   </w:style>
+  <w:style w:type="paragraph" w:styleId="TableContents">
+    <w:name w:val="Table Contents"/>
+    <w:basedOn w:val="Normal"/>
+    <w:qFormat/>
+    <w:pPr>
+      <w:widowControl w:val="false"/>
+      <w:suppressLineNumbers/>
+    </w:pPr>
+    <w:rPr/>
+  </w:style>
+  <w:style w:type="paragraph" w:styleId="TableHeading">
+    <w:name w:val="Table Heading"/>
+    <w:basedOn w:val="TableContents"/>
+    <w:qFormat/>
+    <w:pPr>
+      <w:suppressLineNumbers/>
+      <w:jc w:val="center"/>
+    </w:pPr>
+    <w:rPr>
+      <w:b/>
+      <w:bCs/>
+    </w:rPr>
+  </w:style>
   <w:style w:type="numbering" w:styleId="NoList" w:default="1">
     <w:name w:val="No List"/>
     <w:uiPriority w:val="99"/>

</xml_diff>